<commit_message>
Solucion de bugs de carga y recuperacion de nodos
</commit_message>
<xml_diff>
--- a/informe/Anexo-A-ADRs.docx
+++ b/informe/Anexo-A-ADRs.docx
@@ -25502,7 +25502,7 @@
                 <w:sz w:val="20"/>
                 <w:szCs w:val="20"/>
               </w:rPr>
-              <w:t xml:space="preserve">90 pruebas, todas en verde (incluye: línea truncada por corte de luz, compactación, reinicio con pendientes, reintento del mismo mensaje, muerte entre publicar y guardar).</w:t>
+              <w:t xml:space="preserve">95 pruebas, todas en verde (incluye: línea truncada por corte de luz, compactación, reinicio con pendientes, reintento del mismo mensaje, muerte entre publicar y guardar).</w:t>
             </w:r>
           </w:p>
         </w:tc>
@@ -40943,7 +40943,7 @@
         <w:jc w:val="both"/>
       </w:pPr>
       <w:r>
-        <w:t xml:space="preserve">90 pruebas unitarias; las del motor usan las reglas reales del YAML y las de resiliencia simulan cortes de luz, fallas de Kafka y muertes de proceso;</w:t>
+        <w:t xml:space="preserve">95 pruebas unitarias; las del motor usan las reglas reales del YAML y las de resiliencia simulan cortes de luz, fallas de Kafka y muertes de proceso;</w:t>
       </w:r>
     </w:p>
     <w:p>

</xml_diff>